<commit_message>
Add a cross-section diagram of the vault for the video
figures/vault_diagram.png: aluminium box (3.7 mm) with a polyethylene
liner (7.5 mm) around the flight computer, power control and memory, the
electronics on aluminium feet; dose and mass numbers read from
shielding_summary.json. Script and asset files point S6d to it.

Co-Authored-By: Claude Opus 5.5 <noreply@anthropic.com>
Claude-Session: https://claude.ai/code/session_01QqiiXvinrJ56urYhvNQFPm
</commit_message>
<xml_diff>
--- a/docs/video_assets.docx
+++ b/docs/video_assets.docx
@@ -1329,7 +1329,7 @@
           <w:sz w:val="21"/>
           <w:szCs w:val="21"/>
         </w:rPr>
-        <w:t xml:space="preserve">实物道具：一块 3–4 mm 的铝板，叠上一块约 8 mm 的聚乙烯砧板（白色的 HDPE 菜板就是高密度聚乙烯）；再拿一个 30×30×15 cm 的纸箱当保险箱模型。这是全片最"动手"的镜头。</w:t>
+        <w:t xml:space="preserve">figures/vault_diagram.png：保险箱剖面图，标了铝 3.7 mm、聚乙烯 7.5 mm 和 1 kg、50 倍两个数。之后可以接实物道具：一块 3–4 mm 的铝板，叠上一块约 8 mm 的聚乙烯砧板（白色的 HDPE 菜板就是高密度聚乙烯）；再拿一个 30×30×15 cm 的纸箱当保险箱模型。这是全片最"动手"的镜头。</w:t>
       </w:r>
     </w:p>
     <w:p>
@@ -1672,7 +1672,7 @@
         </w:rPr>
         <w:t xml:space="preserve">地址：</w:t>
       </w:r>
-      <w:hyperlink w:history="1" r:id="rIdsx86msqjauwthhl5fhzhv">
+      <w:hyperlink w:history="1" r:id="rIdmglrjm5ucnmtjbv_217x5">
         <w:r>
           <w:rPr>
             <w:rFonts w:ascii="Calibri" w:cs="Calibri" w:eastAsia="Microsoft YaHei" w:hAnsi="Calibri"/>
@@ -1755,7 +1755,7 @@
         </w:rPr>
         <w:t xml:space="preserve">地址：</w:t>
       </w:r>
-      <w:hyperlink w:history="1" r:id="rIdea95785p4bu-vimmgx3ht">
+      <w:hyperlink w:history="1" r:id="rIdxsmnvsv5cixciiwwtcyr-">
         <w:r>
           <w:rPr>
             <w:rFonts w:ascii="Calibri" w:cs="Calibri" w:eastAsia="Microsoft YaHei" w:hAnsi="Calibri"/>
@@ -1838,7 +1838,7 @@
         </w:rPr>
         <w:t xml:space="preserve">地址：</w:t>
       </w:r>
-      <w:hyperlink w:history="1" r:id="rId2ssgn1g9rew2cuz41y68n">
+      <w:hyperlink w:history="1" r:id="rId-4xqx5nbq09dqfhd-_ksm">
         <w:r>
           <w:rPr>
             <w:rFonts w:ascii="Calibri" w:cs="Calibri" w:eastAsia="Microsoft YaHei" w:hAnsi="Calibri"/>
@@ -1921,7 +1921,7 @@
         </w:rPr>
         <w:t xml:space="preserve">地址：</w:t>
       </w:r>
-      <w:hyperlink w:history="1" r:id="rIdlouh5pe16xtrktxh6jwxf">
+      <w:hyperlink w:history="1" r:id="rIdbzj9ltg1u_1mhbbukk8vw">
         <w:r>
           <w:rPr>
             <w:rFonts w:ascii="Calibri" w:cs="Calibri" w:eastAsia="Microsoft YaHei" w:hAnsi="Calibri"/>
@@ -2004,7 +2004,7 @@
         </w:rPr>
         <w:t xml:space="preserve">地址：</w:t>
       </w:r>
-      <w:hyperlink w:history="1" r:id="rIdr6lbr9o3yhc0owjyt88rq">
+      <w:hyperlink w:history="1" r:id="rIdq3xvz7olrqtaf_rlp-n39">
         <w:r>
           <w:rPr>
             <w:rFonts w:ascii="Calibri" w:cs="Calibri" w:eastAsia="Microsoft YaHei" w:hAnsi="Calibri"/>
@@ -2087,7 +2087,7 @@
         </w:rPr>
         <w:t xml:space="preserve">地址：</w:t>
       </w:r>
-      <w:hyperlink w:history="1" r:id="rIdf7338mivqxbyjbz_z7lvg">
+      <w:hyperlink w:history="1" r:id="rIdt3aw-yqo4xgbotvupvlru">
         <w:r>
           <w:rPr>
             <w:rFonts w:ascii="Calibri" w:cs="Calibri" w:eastAsia="Microsoft YaHei" w:hAnsi="Calibri"/>
@@ -2170,7 +2170,7 @@
         </w:rPr>
         <w:t xml:space="preserve">地址：</w:t>
       </w:r>
-      <w:hyperlink w:history="1" r:id="rId-6_zzjkweejmu1i0_xtxv">
+      <w:hyperlink w:history="1" r:id="rIdroct0_jrs5y7s9vgjy4rq">
         <w:r>
           <w:rPr>
             <w:rFonts w:ascii="Calibri" w:cs="Calibri" w:eastAsia="Microsoft YaHei" w:hAnsi="Calibri"/>

</xml_diff>